<commit_message>
Anteproyecto definitvo + Mem + Bugfixes
Borramos la plantilla, no debe estar allí

Eliminamos un test que al cambiar la creación de una solución del problema de la mochila no tiene sentido

Anteproyecto final + actualización de la memoria + seguimos con la arquitectura
</commit_message>
<xml_diff>
--- a/docs/preliminary_project/anteproyecto.docx
+++ b/docs/preliminary_project/anteproyecto.docx
@@ -1031,16 +1031,7 @@
                 <w:szCs w:val="20"/>
                 <w:rtl w:val="0"/>
               </w:rPr>
-              <w:t xml:space="preserve"> </w:t>
-            </w:r>
-            <w:r>
-              <w:rPr>
-                <w:rFonts w:ascii="Times New Roman" w:cs="Times New Roman" w:eastAsia="Times New Roman" w:hAnsi="Times New Roman"/>
-                <w:sz w:val="20"/>
-                <w:szCs w:val="20"/>
-                <w:rtl w:val="0"/>
-              </w:rPr>
-              <w:t xml:space="preserve">y, en general, presentan limitaciones en cuanto a madurez, extensibilidad y variedad de algoritmos disponibles.</w:t>
+              <w:t xml:space="preserve">. En general, presentan limitaciones en cuanto a madurez, extensibilidad y variedad de algoritmos disponibles.</w:t>
             </w:r>
           </w:p>
           <w:p>
@@ -2216,7 +2207,7 @@
                 <w:szCs w:val="20"/>
                 <w:rtl w:val="0"/>
               </w:rPr>
-              <w:t xml:space="preserve">Respresentan la unidad fundamental de compilación, equivalente a una biblioteca o paquete en otros lenguajes, que contiene código Rust empaquetado. En esta fase se estudiarán los más relevantes de cara a este trabajo.</w:t>
+              <w:t xml:space="preserve">Representan la unidad fundamental de compilación, equivalente a una biblioteca o paquete en otros lenguajes, que contiene código Rust empaquetado. En esta fase se estudiarán los más relevantes de cara a este trabajo.</w:t>
             </w:r>
           </w:p>
           <w:p>
@@ -5404,25 +5395,8 @@
     </w:p>
     <w:p>
       <w:pPr>
-        <w:rPr>
-          <w:rFonts w:ascii="Times New Roman" w:cs="Times New Roman" w:eastAsia="Times New Roman" w:hAnsi="Times New Roman"/>
-          <w:sz w:val="24"/>
-          <w:szCs w:val="24"/>
-        </w:rPr>
-      </w:pPr>
-      <w:r>
-        <w:rPr>
-          <w:rtl w:val="0"/>
-        </w:rPr>
-      </w:r>
-    </w:p>
-    <w:p>
-      <w:pPr>
         <w:rPr/>
       </w:pPr>
-      <w:r>
-        <w:br w:type="page"/>
-      </w:r>
       <w:r>
         <w:rPr>
           <w:rtl w:val="0"/>

</xml_diff>